<commit_message>
docs: define two core Study 3 promotion stages
</commit_message>
<xml_diff>
--- a/framework_revision/Doctoral_Dissertation_Framework_PEI_Rongkang_clean.docx
+++ b/framework_revision/Doctoral_Dissertation_Framework_PEI_Rongkang_clean.docx
@@ -1425,7 +1425,7 @@
         <w:rPr>
           <w:rFonts w:eastAsia="Hiragino Mincho ProN"/>
         </w:rPr>
-        <w:t>Study 3 examines whether access to KAKEN-related academic resources is associated with promotion and whether the association changes across career stages.</w:t>
+        <w:t>Study 3 examines whether access to KAKEN-related academic resources is associated with promotion and whether the association changes across career stages. It contains two core promotion analyses: the early-career transition to Associate Professor and the later transition from Associate Professor to Full Professor. A descriptive analysis around AP appointment is supplementary and does not replace the second promotion model.</w:t>
       </w:r>
     </w:p>
     <w:p>
@@ -1475,7 +1475,7 @@
         <w:pStyle w:val="4"/>
       </w:pPr>
       <w:r>
-        <w:t>6.4 Variables and Measures</w:t>
+        <w:t>6.4 KAKEN Resource Measures</w:t>
       </w:r>
     </w:p>
     <w:p>
@@ -1486,7 +1486,7 @@
         <w:rPr>
           <w:rFonts w:eastAsia="Hiragino Mincho ProN"/>
         </w:rPr>
-        <w:t>Resources are grouped into participation, project leadership, funding, and project-based network position. Primary measures include any KAKEN participation, PI and Co-I roles, direct funding, degree, PI outdegree, and PI indegree. Weighted degree is reserved for robustness analysis.</w:t>
+        <w:t>Resources are grouped into participation, project leadership, funding, and project-based network position. Primary measures include any KAKEN participation, PI and Co-I roles, direct funding, degree, PI outdegree, and PI indegree. Weighted degree is reserved for robustness analysis. All predictors for promotion in fiscal year t are constructed from information observed before t.</w:t>
       </w:r>
     </w:p>
     <w:p>
@@ -1494,7 +1494,7 @@
         <w:pStyle w:val="4"/>
       </w:pPr>
       <w:r>
-        <w:t>6.5 Stage-Specific Analytical Strategy</w:t>
+        <w:t>6.5 Stage 1: PhD/Early Career to Associate Professor</w:t>
       </w:r>
     </w:p>
     <w:p>
@@ -1505,15 +1505,18 @@
         <w:rPr>
           <w:rFonts w:eastAsia="Hiragino Mincho ProN"/>
         </w:rPr>
-        <w:t>Separate model families examine PhD to Associate Professor and Associate Professor to Full Professor. Each uses only resources observed before year t. Gender-by-resource and stage-by-resource terms are introduced selectively; three-way interactions require adequate support.</w:t>
-      </w:r>
-    </w:p>
-    <w:p>
-      <w:pPr>
-        <w:pStyle w:val="4"/>
-      </w:pPr>
-      <w:r>
-        <w:t>6.6 Results: PhD to Associate Professor</w:t>
+        <w:t>The primary Stage 1 risk set begins in the first fiscal year after PhD completion. Researchers remain at risk until their first validated Associate Professor appointment or the observation endpoint. Researchers who are not observed as AP remain as right-censored cases, and post-event person-years are excluded.</w:t>
+      </w:r>
+    </w:p>
+    <w:p>
+      <w:pPr>
+        <w:widowControl/>
+      </w:pPr>
+      <w:r>
+        <w:rPr>
+          <w:rFonts w:eastAsia="Hiragino Mincho ProN"/>
+        </w:rPr>
+        <w:t>Where postdoctoral appointments can be identified reliably, postdoctoral status is constructed as a time-varying career state. A secondary Postdoc-to-Associate-Professor analysis will examine promotion after entry into an observed postdoctoral appointment. An observed postdoc is not an inclusion requirement for the primary Stage 1 analysis: some researchers move directly into faculty or other academic positions, and postdoctoral histories may be incomplete.</w:t>
       </w:r>
     </w:p>
     <w:p>
@@ -1599,7 +1602,29 @@
         <w:pStyle w:val="4"/>
       </w:pPr>
       <w:r>
-        <w:t>6.7 Results: Associate Professor to Full Professor</w:t>
+        <w:t>6.6 Stage 2: Associate Professor to Full Professor</w:t>
+      </w:r>
+    </w:p>
+    <w:p>
+      <w:pPr>
+        <w:widowControl/>
+      </w:pPr>
+      <w:r>
+        <w:rPr>
+          <w:rFonts w:eastAsia="Hiragino Mincho ProN"/>
+        </w:rPr>
+        <w:t>The Stage 2 risk set begins in the first fiscal year after the validated Associate Professor appointment and ends at first observed Full Professor appointment or censoring. Researchers already observed as Full Professor when AP timing first becomes observable are excluded or flagged for chronology review.</w:t>
+      </w:r>
+    </w:p>
+    <w:p>
+      <w:pPr>
+        <w:widowControl/>
+      </w:pPr>
+      <w:r>
+        <w:rPr>
+          <w:rFonts w:eastAsia="Hiragino Mincho ProN"/>
+        </w:rPr>
+        <w:t>KAKEN predictors in this stage are measured after the AP appointment and before the FP transition year. Pre-AP resources may be retained as baseline career history, but they are not substituted for the post-AP resource measures that define the core Stage 2 analysis. This separation ensures that the stage comparison concerns resources accumulated while researchers are at risk for the relevant promotion.</w:t>
       </w:r>
     </w:p>
     <w:p>
@@ -1685,7 +1710,18 @@
         <w:pStyle w:val="4"/>
       </w:pPr>
       <w:r>
-        <w:t>6.8 Gender Differences in Resource Associations</w:t>
+        <w:t>6.7 Gender Differences Across Career Stages</w:t>
+      </w:r>
+    </w:p>
+    <w:p>
+      <w:pPr>
+        <w:widowControl/>
+      </w:pPr>
+      <w:r>
+        <w:rPr>
+          <w:rFonts w:eastAsia="Hiragino Mincho ProN"/>
+        </w:rPr>
+        <w:t>Separate stage-specific model families are primary. Gender-by-resource terms are estimated within each stage, and stage-by-resource comparisons are made across aligned specifications. A pooled model with gender-by-stage-by-resource interactions will be used only when the data provide adequate events and common support.</w:t>
       </w:r>
     </w:p>
     <w:p>
@@ -1750,6 +1786,36 @@
       </w:r>
       <w:r>
         <w:t>[Insert interpretation linked to theory here]</w:t>
+      </w:r>
+    </w:p>
+    <w:p>
+      <w:pPr>
+        <w:pStyle w:val="4"/>
+      </w:pPr>
+      <w:r>
+        <w:t>6.8 Supplementary Post-AP Resource Trajectories</w:t>
+      </w:r>
+    </w:p>
+    <w:p>
+      <w:pPr>
+        <w:widowControl/>
+      </w:pPr>
+      <w:r>
+        <w:rPr>
+          <w:rFonts w:eastAsia="Hiragino Mincho ProN"/>
+        </w:rPr>
+        <w:t>A descriptive event-time analysis may trace KAKEN participation, PI status, direct funding, and network position before and after Associate Professor appointment. Its purpose is to show how observed resources change around AP appointment. It is not a causal design and does not replace the Associate-Professor-to-Full-Professor promotion model.</w:t>
+      </w:r>
+    </w:p>
+    <w:p>
+      <w:pPr>
+        <w:widowControl/>
+      </w:pPr>
+      <w:r>
+        <w:rPr>
+          <w:rFonts w:eastAsia="Hiragino Mincho ProN"/>
+        </w:rPr>
+        <w:t>[Insert descriptive post-AP event-time trajectories here]</w:t>
       </w:r>
     </w:p>
     <w:p>

</xml_diff>

<commit_message>
docs: standardize promotion timeline terminology
</commit_message>
<xml_diff>
--- a/framework_revision/Doctoral_Dissertation_Framework_PEI_Rongkang_clean.docx
+++ b/framework_revision/Doctoral_Dissertation_Framework_PEI_Rongkang_clean.docx
@@ -98,7 +98,7 @@
           <w:color w:val="4D5761"/>
           <w:sz w:val="28"/>
         </w:rPr>
-        <w:t>Promotion Timing, Institutional Mobility, and KAKEN-Related Academic Resources</w:t>
+        <w:t>Promotion Timeline, Institutional Mobility, and KAKEN-Related Academic Resources</w:t>
       </w:r>
     </w:p>
     <w:p>
@@ -188,7 +188,7 @@
         <w:rPr>
           <w:rFonts w:eastAsia="Hiragino Mincho ProN"/>
         </w:rPr>
-        <w:t>Gender inequality in academic careers is visible not only in who reaches senior rank, but also in when advancement occurs and in the organizational and scholarly resources available along the way. This dissertation uses longitudinal researchmap career histories linked to KAKEN project records to examine academic careers in Japan. It brings promotion timing, institutional mobility, and access to academic resources into a common career-course framework while keeping the three empirical studies analytically distinct.</w:t>
+        <w:t>Gender inequality in academic careers is visible not only in who reaches senior rank, but also in when advancement occurs and in the organizational and scholarly resources available along the way. This dissertation uses longitudinal researchmap career histories linked to KAKEN project records to examine academic careers in Japan. It brings the promotion timeline, institutional mobility, and access to academic resources into a common career-course framework while keeping the three empirical studies analytically distinct.</w:t>
       </w:r>
     </w:p>
     <w:p>
@@ -199,7 +199,7 @@
         <w:rPr>
           <w:rFonts w:eastAsia="Hiragino Mincho ProN"/>
         </w:rPr>
-        <w:t>Study 1 identifies where gender differences appear in observed promotion timelines from the PhD to Associate Professor and from Associate Professor to Full Professor. Study 2 asks whether the number of institutional moves is associated with promotion timing and whether that relationship differs by gender. Sequence analysis provides a secondary account of recurring patterns of institutional stability and movement. Study 3 examines KAKEN-related academic resources across two career stages. It considers participation, project leadership, funding, and project-based network position before promotion.</w:t>
+        <w:t>Study 1 identifies where gender differences appear in the observed promotion timeline from the PhD to Associate Professor and from Associate Professor to Full Professor. Study 2 asks whether the number of institutional moves is associated with the promotion timeline and whether that relationship differs by gender. Sequence analysis provides a secondary account of recurring patterns of institutional stability and movement. Study 3 examines KAKEN-related academic resources across two career stages. It considers participation, project leadership, funding, and project-based network position before promotion.</w:t>
       </w:r>
     </w:p>
     <w:p>
@@ -269,7 +269,7 @@
         <w:spacing w:after="20"/>
       </w:pPr>
       <w:r>
-        <w:t>Chapter 4. Study 1: Gendered Promotion Timelines</w:t>
+        <w:t>Chapter 4. Study 1: Gendered Promotion Timeline</w:t>
       </w:r>
     </w:p>
     <w:p>
@@ -277,7 +277,7 @@
         <w:spacing w:after="20"/>
       </w:pPr>
       <w:r>
-        <w:t>Chapter 5. Study 2: Institutional Mobility and Promotion Timing</w:t>
+        <w:t>Chapter 5. Study 2: Institutional Mobility and the Promotion Timeline</w:t>
       </w:r>
     </w:p>
     <w:p>
@@ -363,7 +363,7 @@
         <w:br/>
         <w:t>Figure 4.1. Study 1 analytic samples</w:t>
         <w:br/>
-        <w:t>Figure 4.2. Study 1 observed promotion timelines</w:t>
+        <w:t>Figure 4.2. Study 1 observed promotion timeline</w:t>
         <w:br/>
         <w:t>[Additional figures will be inserted as empirical chapters are completed]</w:t>
       </w:r>
@@ -445,7 +445,7 @@
         <w:rPr>
           <w:rFonts w:eastAsia="Hiragino Mincho ProN"/>
         </w:rPr>
-        <w:t>Three gaps guide the dissertation. Promotion timing is often studied only among people whose transitions are observed. Institutional mobility is commonly treated as individual choice even though the capacity to move depends on organizational opportunity and private circumstances. Research funding is frequently measured as an outcome rather than as a career resource that may have different relevance at different stages.</w:t>
+        <w:t>Three gaps guide the dissertation. The promotion timeline is often studied only among people whose transitions are observed. Institutional mobility is commonly treated as individual choice even though the capacity to move depends on organizational opportunity and private circumstances. Research funding is frequently measured as an outcome rather than as a career resource that may have different relevance at different stages.</w:t>
       </w:r>
     </w:p>
     <w:p>
@@ -464,7 +464,7 @@
         <w:rPr>
           <w:rFonts w:eastAsia="Hiragino Mincho ProN"/>
         </w:rPr>
-        <w:t>RQ1. Where do gender differences appear in observed academic promotion timelines in Japan?</w:t>
+        <w:t>RQ1. Where do gender differences appear in the observed academic promotion timeline in Japan?</w:t>
       </w:r>
     </w:p>
     <w:p>
@@ -475,7 +475,7 @@
         <w:rPr>
           <w:rFonts w:eastAsia="Hiragino Mincho ProN"/>
         </w:rPr>
-        <w:t>RQ2. How is the number of institutional moves associated with promotion timing, and does this association differ between women and men?</w:t>
+        <w:t>RQ2. How is the number of institutional moves associated with the promotion timeline, and does this association differ between women and men?</w:t>
       </w:r>
     </w:p>
     <w:p>
@@ -524,7 +524,7 @@
         <w:rPr>
           <w:rFonts w:eastAsia="Hiragino Mincho ProN"/>
         </w:rPr>
-        <w:t>The dissertation links researchmap career records to KAKEN project data and organizes them by fiscal year. Study 1 compares observed promotion timelines. Studies 2 and 3 use researcher-year risk sets that retain researchers who have not yet experienced promotion. Study 2 also uses multichannel sequence analysis to describe recurring mobility pathways.</w:t>
+        <w:t>The dissertation links researchmap career records to KAKEN project data and organizes them by fiscal year. Study 1 compares the observed promotion timeline across career stages. Studies 2 and 3 use researcher-year risk sets that retain researchers who have not yet experienced promotion. Study 2 also uses multichannel sequence analysis to describe recurring mobility pathways.</w:t>
       </w:r>
     </w:p>
     <w:p>
@@ -543,7 +543,7 @@
         <w:rPr>
           <w:rFonts w:eastAsia="Hiragino Mincho ProN"/>
         </w:rPr>
-        <w:t>The empirical sequence is straightforward: timing, mobility, and academic resources. Chapter 4 establishes where gender differences appear. Chapter 5 examines institutional movement. Chapter 6 turns to KAKEN-related resources across career stages.</w:t>
+        <w:t>The empirical sequence is straightforward: promotion timeline, mobility, and academic resources. Chapter 4 establishes where gender differences appear. Chapter 5 examines institutional movement. Chapter 6 turns to KAKEN-related resources across career stages.</w:t>
       </w:r>
     </w:p>
     <w:p>
@@ -562,7 +562,7 @@
         <w:rPr>
           <w:rFonts w:eastAsia="Hiragino Mincho ProN"/>
         </w:rPr>
-        <w:t>The dissertation connects career timing to the organizational and scholarly conditions under which promotion occurs. It also extends completed-transition comparisons by retaining right-censored careers in the later studies.</w:t>
+        <w:t>The dissertation connects the promotion timeline to the organizational and scholarly conditions under which promotion occurs. It also extends completed-transition comparisons by retaining right-censored careers in the later studies.</w:t>
       </w:r>
     </w:p>
     <w:p>
@@ -608,7 +608,7 @@
         <w:rPr>
           <w:rFonts w:eastAsia="Hiragino Mincho ProN"/>
         </w:rPr>
-        <w:t>Gender gaps in rank can arise through unequal entry into promotion, different timing among those promoted, or differential observation. These processes should not be collapsed into a single measure of advancement (Allison and Long, 1987; Pei et al., 2026).</w:t>
+        <w:t>Gender gaps in rank can arise through unequal entry into promotion, differences in the promotion timeline among those promoted, or differential observation. These processes should not be collapsed into a single measure of advancement (Allison and Long, 1987; Pei et al., 2026).</w:t>
       </w:r>
     </w:p>
     <w:p>
@@ -703,7 +703,7 @@
         <w:rPr>
           <w:rFonts w:eastAsia="Hiragino Mincho ProN"/>
         </w:rPr>
-        <w:t>Existing work rarely examines promotion timing, institutional movement, and project-based academic resources with the same longitudinal population. The dissertation addresses this gap without treating mobility or funding as exogenous interventions.</w:t>
+        <w:t>Existing work rarely examines the promotion timeline, institutional movement, and project-based academic resources with the same longitudinal population. The dissertation addresses this gap without treating mobility or funding as exogenous interventions.</w:t>
       </w:r>
     </w:p>
     <w:p>
@@ -909,7 +909,7 @@
         <w:pStyle w:val="3"/>
       </w:pPr>
       <w:r>
-        <w:t>Chapter 4. Study 1: Gendered Promotion Timelines</w:t>
+        <w:t>Chapter 4. Study 1: Gendered Promotion Timeline</w:t>
       </w:r>
     </w:p>
     <w:p>
@@ -947,7 +947,7 @@
         <w:rPr>
           <w:rFonts w:eastAsia="Hiragino Mincho ProN"/>
         </w:rPr>
-        <w:t>RQ1. Where do gender differences appear in observed academic promotion timelines in Japan?</w:t>
+        <w:t>RQ1. Where do gender differences appear in the observed academic promotion timeline in Japan?</w:t>
       </w:r>
     </w:p>
     <w:p>
@@ -1038,7 +1038,7 @@
         <w:rPr>
           <w:rFonts w:eastAsia="Hiragino Mincho ProN"/>
         </w:rPr>
-        <w:t>Promotion timing is measured between validated milestones. Completed-transition comparisons are interpreted alongside survival-based checks that retain right-censoring.</w:t>
+        <w:t>The promotion timeline is measured between validated milestones. Completed-transition comparisons are interpreted alongside survival-based checks that retain right-censoring.</w:t>
       </w:r>
     </w:p>
     <w:p>
@@ -1110,7 +1110,7 @@
           <w:i/>
           <w:sz w:val="18"/>
         </w:rPr>
-        <w:t>Figure 4.2. Study 1 mean observed promotion timelines by gender and career stage. Source: Pei et al. (2026).</w:t>
+        <w:t>Figure 4.2. Study 1 mean observed promotion timeline by gender and career stage. Source: Pei et al. (2026).</w:t>
       </w:r>
     </w:p>
     <w:p>
@@ -1129,7 +1129,7 @@
         <w:rPr>
           <w:rFonts w:eastAsia="Hiragino Mincho ProN"/>
         </w:rPr>
-        <w:t>The early-career transition deserves closer attention, but timing alone cannot reveal how organizational opportunities shape advancement. The distinction between transition duration and entry into promotion motivates the risk-set designs that follow.</w:t>
+        <w:t>The early-career transition deserves closer attention, but the promotion timeline alone cannot reveal how organizational opportunities shape advancement. The distinction between transition duration and entry into promotion motivates the risk-set designs that follow.</w:t>
       </w:r>
     </w:p>
     <w:p>
@@ -1148,7 +1148,7 @@
         <w:rPr>
           <w:rFonts w:eastAsia="Hiragino Mincho ProN"/>
         </w:rPr>
-        <w:t>Study 1 shows where observed timing differences appear. Chapter 5 asks whether institutional movement is related to those promotion timelines.</w:t>
+        <w:t>Study 1 shows where differences in the observed promotion timeline appear. Chapter 5 asks whether institutional movement is related to that timeline.</w:t>
       </w:r>
     </w:p>
     <w:p>
@@ -1156,7 +1156,7 @@
         <w:pStyle w:val="3"/>
       </w:pPr>
       <w:r>
-        <w:t>Chapter 5. Study 2: Institutional Mobility and Promotion Timing</w:t>
+        <w:t>Chapter 5. Study 2: Institutional Mobility and the Promotion Timeline</w:t>
       </w:r>
     </w:p>
     <w:p>
@@ -1194,9 +1194,9 @@
         <w:rPr>
           <w:rFonts w:eastAsia="Hiragino Mincho ProN"/>
         </w:rPr>
-        <w:t>H2.1 More institutional moves are associated with promotion timing.</w:t>
+        <w:t>H2.1 More institutional moves are associated with the promotion timeline.</w:t>
         <w:br/>
-        <w:t>H2.2 The association between move count and promotion timing differs between women and men.</w:t>
+        <w:t>H2.2 The association between move count and the promotion timeline differs between women and men.</w:t>
         <w:br/>
         <w:t>H2.3 Upward moves are more strongly associated with promotion than lateral or downward moves.</w:t>
       </w:r>
@@ -1217,7 +1217,7 @@
         <w:rPr>
           <w:rFonts w:eastAsia="Hiragino Mincho ProN"/>
         </w:rPr>
-        <w:t>RQ2. How is the number of institutional moves associated with promotion timing, and does this association differ between women and men?</w:t>
+        <w:t>RQ2. How is the number of institutional moves associated with the promotion timeline, and does this association differ between women and men?</w:t>
       </w:r>
     </w:p>
     <w:p>
@@ -1613,7 +1613,7 @@
         <w:rPr>
           <w:rFonts w:eastAsia="Hiragino Mincho ProN"/>
         </w:rPr>
-        <w:t>The Stage 2 risk set begins in the first fiscal year after the validated Associate Professor appointment and ends at first observed Full Professor appointment or censoring. Researchers already observed as Full Professor when AP timing first becomes observable are excluded or flagged for chronology review.</w:t>
+        <w:t>The Stage 2 risk set begins in the first fiscal year after the validated Associate Professor appointment and ends at first observed Full Professor appointment or censoring. Researchers already observed as Full Professor when the AP appointment year first becomes observable are excluded or flagged for chronology review.</w:t>
       </w:r>
     </w:p>
     <w:p>
@@ -1907,7 +1907,7 @@
         <w:pStyle w:val="4"/>
       </w:pPr>
       <w:r>
-        <w:t>7.2 Promotion Timing</w:t>
+        <w:t>7.2 Promotion Timeline</w:t>
       </w:r>
     </w:p>
     <w:p>

</xml_diff>

<commit_message>
docs: align dissertation argument and Tohoku format
</commit_message>
<xml_diff>
--- a/framework_revision/Doctoral_Dissertation_Framework_PEI_Rongkang_clean.docx
+++ b/framework_revision/Doctoral_Dissertation_Framework_PEI_Rongkang_clean.docx
@@ -140,7 +140,31 @@
         <w:rPr>
           <w:rFonts w:eastAsia="Hiragino Mincho ProN"/>
         </w:rPr>
+        <w:t>Dissertation submitted to</w:t>
+      </w:r>
+    </w:p>
+    <w:p>
+      <w:pPr>
+        <w:widowControl/>
+        <w:jc w:val="center"/>
+      </w:pPr>
+      <w:r>
+        <w:rPr>
+          <w:rFonts w:eastAsia="Hiragino Mincho ProN"/>
+        </w:rPr>
         <w:t>Graduate School of Arts and Letters, Tohoku University</w:t>
+      </w:r>
+    </w:p>
+    <w:p>
+      <w:pPr>
+        <w:widowControl/>
+        <w:jc w:val="center"/>
+      </w:pPr>
+      <w:r>
+        <w:rPr>
+          <w:rFonts w:eastAsia="Hiragino Mincho ProN"/>
+        </w:rPr>
+        <w:t>in fulfillment of the requirements for the degree of</w:t>
       </w:r>
     </w:p>
     <w:p>
@@ -155,6 +179,163 @@
         <w:t>Doctor of Philosophy in Art and Letters</w:t>
       </w:r>
     </w:p>
+    <w:tbl>
+      <w:tblPr>
+        <w:tblW w:type="auto" w:w="0"/>
+        <w:jc w:val="center"/>
+        <w:tblLayout w:type="fixed"/>
+        <w:tblLook w:firstColumn="1" w:firstRow="1" w:lastColumn="0" w:lastRow="0" w:noHBand="0" w:noVBand="1" w:val="04A0"/>
+      </w:tblPr>
+      <w:tblGrid>
+        <w:gridCol w:w="4657"/>
+        <w:gridCol w:w="4657"/>
+      </w:tblGrid>
+      <w:tr>
+        <w:trPr>
+          <w:tblHeader w:val="true"/>
+        </w:trPr>
+        <w:tc>
+          <w:tcPr>
+            <w:tcW w:type="dxa" w:w="1400"/>
+            <w:vAlign w:val="center"/>
+            <w:shd w:fill="D9EAF7"/>
+          </w:tcPr>
+          <w:p>
+            <w:pPr>
+              <w:spacing w:before="20" w:after="20" w:line="240" w:lineRule="auto"/>
+            </w:pPr>
+            <w:r>
+              <w:rPr>
+                <w:rFonts w:ascii="Arial" w:hAnsi="Arial"/>
+                <w:b/>
+                <w:sz w:val="18"/>
+              </w:rPr>
+              <w:t>Supervisor:</w:t>
+            </w:r>
+          </w:p>
+        </w:tc>
+        <w:tc>
+          <w:tcPr>
+            <w:tcW w:type="dxa" w:w="3600"/>
+            <w:vAlign w:val="center"/>
+            <w:shd w:fill="D9EAF7"/>
+          </w:tcPr>
+          <w:p>
+            <w:pPr>
+              <w:spacing w:before="20" w:after="20" w:line="240" w:lineRule="auto"/>
+            </w:pPr>
+            <w:r>
+              <w:rPr>
+                <w:rFonts w:ascii="Arial" w:hAnsi="Arial"/>
+                <w:b/>
+                <w:sz w:val="18"/>
+              </w:rPr>
+              <w:t>Prof. LYU Zeyu</w:t>
+            </w:r>
+          </w:p>
+        </w:tc>
+      </w:tr>
+      <w:tr>
+        <w:tc>
+          <w:tcPr>
+            <w:tcW w:type="dxa" w:w="1400"/>
+            <w:vAlign w:val="center"/>
+          </w:tcPr>
+          <w:p>
+            <w:pPr>
+              <w:spacing w:before="20" w:after="20" w:line="240" w:lineRule="auto"/>
+            </w:pPr>
+            <w:r>
+              <w:rPr>
+                <w:rFonts w:ascii="Arial" w:hAnsi="Arial"/>
+                <w:sz w:val="18"/>
+              </w:rPr>
+              <w:t>Referees:</w:t>
+            </w:r>
+          </w:p>
+        </w:tc>
+        <w:tc>
+          <w:tcPr>
+            <w:tcW w:type="dxa" w:w="3600"/>
+            <w:vAlign w:val="center"/>
+          </w:tcPr>
+          <w:p>
+            <w:pPr>
+              <w:spacing w:before="20" w:after="20" w:line="240" w:lineRule="auto"/>
+            </w:pPr>
+            <w:r>
+              <w:rPr>
+                <w:rFonts w:ascii="Arial" w:hAnsi="Arial"/>
+                <w:sz w:val="18"/>
+              </w:rPr>
+              <w:t>Prof. __________________</w:t>
+            </w:r>
+          </w:p>
+        </w:tc>
+      </w:tr>
+      <w:tr>
+        <w:tc>
+          <w:tcPr>
+            <w:tcW w:type="dxa" w:w="1400"/>
+            <w:vAlign w:val="center"/>
+          </w:tcPr>
+          <w:p>
+            <w:pPr>
+              <w:spacing w:before="20" w:after="20" w:line="240" w:lineRule="auto"/>
+            </w:pPr>
+          </w:p>
+        </w:tc>
+        <w:tc>
+          <w:tcPr>
+            <w:tcW w:type="dxa" w:w="3600"/>
+            <w:vAlign w:val="center"/>
+          </w:tcPr>
+          <w:p>
+            <w:pPr>
+              <w:spacing w:before="20" w:after="20" w:line="240" w:lineRule="auto"/>
+            </w:pPr>
+            <w:r>
+              <w:rPr>
+                <w:rFonts w:ascii="Arial" w:hAnsi="Arial"/>
+                <w:sz w:val="18"/>
+              </w:rPr>
+              <w:t>Prof. __________________</w:t>
+            </w:r>
+          </w:p>
+        </w:tc>
+      </w:tr>
+      <w:tr>
+        <w:tc>
+          <w:tcPr>
+            <w:tcW w:type="dxa" w:w="1400"/>
+            <w:vAlign w:val="center"/>
+          </w:tcPr>
+          <w:p>
+            <w:pPr>
+              <w:spacing w:before="20" w:after="20" w:line="240" w:lineRule="auto"/>
+            </w:pPr>
+          </w:p>
+        </w:tc>
+        <w:tc>
+          <w:tcPr>
+            <w:tcW w:type="dxa" w:w="3600"/>
+            <w:vAlign w:val="center"/>
+          </w:tcPr>
+          <w:p>
+            <w:pPr>
+              <w:spacing w:before="20" w:after="20" w:line="240" w:lineRule="auto"/>
+            </w:pPr>
+            <w:r>
+              <w:rPr>
+                <w:rFonts w:ascii="Arial" w:hAnsi="Arial"/>
+                <w:sz w:val="18"/>
+              </w:rPr>
+              <w:t>Prof. __________________</w:t>
+            </w:r>
+          </w:p>
+        </w:tc>
+      </w:tr>
+    </w:tbl>
     <w:p>
       <w:pPr>
         <w:widowControl/>
@@ -164,7 +345,7 @@
         <w:rPr>
           <w:rFonts w:eastAsia="Hiragino Mincho ProN"/>
         </w:rPr>
-        <w:t>Dissertation framework prepared July 2026</w:t>
+        <w:t>Submission Date: July 2026</w:t>
       </w:r>
     </w:p>
     <w:p>
@@ -403,6 +584,11 @@
       </w:r>
     </w:p>
     <w:p>
+      <w:r>
+        <w:br w:type="page"/>
+      </w:r>
+    </w:p>
+    <w:p>
       <w:pPr>
         <w:pStyle w:val="3"/>
       </w:pPr>
@@ -464,6 +650,17 @@
         <w:rPr>
           <w:rFonts w:eastAsia="Hiragino Mincho ProN"/>
         </w:rPr>
+        <w:t>Overall research question. How do gender differences in Japanese academic careers emerge and accumulate through the promotion timeline, institutional mobility, and access to academic resources?</w:t>
+      </w:r>
+    </w:p>
+    <w:p>
+      <w:pPr>
+        <w:widowControl/>
+      </w:pPr>
+      <w:r>
+        <w:rPr>
+          <w:rFonts w:eastAsia="Hiragino Mincho ProN"/>
+        </w:rPr>
         <w:t>RQ1. Where do gender differences appear in the observed academic promotion timeline in Japan?</w:t>
       </w:r>
     </w:p>
@@ -566,6 +763,11 @@
       </w:r>
     </w:p>
     <w:p>
+      <w:r>
+        <w:br w:type="page"/>
+      </w:r>
+    </w:p>
+    <w:p>
       <w:pPr>
         <w:pStyle w:val="3"/>
       </w:pPr>
@@ -578,7 +780,7 @@
         <w:pStyle w:val="4"/>
       </w:pPr>
       <w:r>
-        <w:t>2.1 Japanese Academic Career Structure</w:t>
+        <w:t>2.1 Promotion Timeline: Locating Gender Differences</w:t>
       </w:r>
     </w:p>
     <w:p>
@@ -589,7 +791,7 @@
         <w:rPr>
           <w:rFonts w:eastAsia="Hiragino Mincho ProN"/>
         </w:rPr>
-        <w:t>Japanese academic careers combine rank progression with substantial variation across fields and institutions. The PhD-to-Associate-Professor transition marks entry into a more secure and organizationally recognized position; the later transition to Full Professor reflects a different stage of evaluation and opportunity.</w:t>
+        <w:t>The first argument concerns where inequality appears in the academic career. Japanese careers combine rank progression with substantial variation across fields and institutions. Gender gaps in senior rank can arise because women and men differ in entry into promotion, in the promotion timeline among those promoted, or in whether a transition is observed at all. Study 1 separates these processes and identifies the career stage at which the observed difference is concentrated (Allison and Long, 1987; Pei et al., 2026).</w:t>
       </w:r>
     </w:p>
     <w:p>
@@ -597,7 +799,7 @@
         <w:pStyle w:val="4"/>
       </w:pPr>
       <w:r>
-        <w:t>2.2 Promotion and Rank Inequality</w:t>
+        <w:t>2.2 Institutional Mobility: The Organizational Pathway</w:t>
       </w:r>
     </w:p>
     <w:p>
@@ -608,7 +810,7 @@
         <w:rPr>
           <w:rFonts w:eastAsia="Hiragino Mincho ProN"/>
         </w:rPr>
-        <w:t>Gender gaps in rank can arise through unequal entry into promotion, differences in the promotion timeline among those promoted, or differential observation. These processes should not be collapsed into a single measure of advancement (Allison and Long, 1987; Pei et al., 2026).</w:t>
+        <w:t>Locating a difference does not explain the organizational path through which careers advance. Institutional moves can open access to positions and organizational settings, yet moving is not a costless individual choice. Gendered-organization theory directs attention to the rules and expectations embedded in academic employment, while linked-lives research shows that career decisions are coordinated with family and partners (Acker, 1990; Bielby and Bielby, 1992). The ability to move may itself be an unequally distributed career resource. Study 2 therefore tests whether cumulative move count is related to the promotion timeline and whether that relationship differs by gender.</w:t>
       </w:r>
     </w:p>
     <w:p>
@@ -616,7 +818,7 @@
         <w:pStyle w:val="4"/>
       </w:pPr>
       <w:r>
-        <w:t>2.3 Institutional Mobility</w:t>
+        <w:t>2.3 Academic Resources: The Accumulation Pathway</w:t>
       </w:r>
     </w:p>
     <w:p>
@@ -627,7 +829,7 @@
         <w:rPr>
           <w:rFonts w:eastAsia="Hiragino Mincho ProN"/>
         </w:rPr>
-        <w:t>Institutional moves can reflect career strategy and constraint. Their meaning depends on when they occur and where they lead. Status-attainment research suggests that mobility can improve organizational position, while segmented labour markets limit the opportunities available to different groups (Bielby and Bielby, 1992; Cañibano et al., 2016).</w:t>
+        <w:t>Organizational movement is only one route through which careers develop. KAKEN participation, project leadership, funding, and collaboration position represent resources accumulated within and across institutions. Cumulative-advantage theory suggests that early access can shape later opportunities, but the value attached to the same resource may vary by career stage and gender (Merton, 1968; DiPrete and Eirich, 2006; Bol et al., 2018). Study 3 compares these associations in the early-career-to-AP and AP-to-FP transitions.</w:t>
       </w:r>
     </w:p>
     <w:p>
@@ -635,7 +837,7 @@
         <w:pStyle w:val="4"/>
       </w:pPr>
       <w:r>
-        <w:t>2.4 KAKEN and Academic Resources</w:t>
+        <w:t>2.4 An Integrated Gendered Career Process</w:t>
       </w:r>
     </w:p>
     <w:p>
@@ -646,7 +848,7 @@
         <w:rPr>
           <w:rFonts w:eastAsia="Hiragino Mincho ProN"/>
         </w:rPr>
-        <w:t>KAKEN participation provides access to project resources and collaboration. PI and Co-I roles mark different forms of project responsibility. These roles are project-specific rather than permanent researcher attributes (JSPS, 2026a; Sato et al., 2021).</w:t>
+        <w:t>The three arguments form a sequence rather than three parallel topics. Study 1 locates the observed difference. Study 2 examines organizational movement as one pathway connected to that difference. Study 3 examines the accumulation of academic resources across career stages. Gendered organizations provide the common explanation for why mobility opportunities and the career value of resources may not be distributed or evaluated uniformly.</w:t>
       </w:r>
     </w:p>
     <w:p>
@@ -654,7 +856,7 @@
         <w:pStyle w:val="4"/>
       </w:pPr>
       <w:r>
-        <w:t>2.5 Gendered Organizations and Career Constraints</w:t>
+        <w:t>2.5 Research Gap and Analytical Expectations</w:t>
       </w:r>
     </w:p>
     <w:p>
@@ -665,45 +867,12 @@
         <w:rPr>
           <w:rFonts w:eastAsia="Hiragino Mincho ProN"/>
         </w:rPr>
-        <w:t>Gendered-organization theory directs attention from individual preference to organizational practices (Acker, 1990). Linked-lives research adds that career decisions are coordinated with partners and family responsibilities. The same institutional move may therefore carry different career implications for women and men.</w:t>
-      </w:r>
-    </w:p>
-    <w:p>
-      <w:pPr>
-        <w:pStyle w:val="4"/>
-      </w:pPr>
-      <w:r>
-        <w:t>2.6 Cumulative Advantage</w:t>
-      </w:r>
-    </w:p>
-    <w:p>
-      <w:pPr>
-        <w:widowControl/>
-      </w:pPr>
-      <w:r>
-        <w:rPr>
-          <w:rFonts w:eastAsia="Hiragino Mincho ProN"/>
-        </w:rPr>
-        <w:t>Early access to funding, leadership, and collaboration can shape later opportunities. Cumulative advantage need not imply an automatic process; it identifies a mechanism through which initially modest differences may grow across career stages (Merton, 1968; DiPrete and Eirich, 2006; Bol et al., 2018).</w:t>
-      </w:r>
-    </w:p>
-    <w:p>
-      <w:pPr>
-        <w:pStyle w:val="4"/>
-      </w:pPr>
-      <w:r>
-        <w:t>2.7 Research Gap</w:t>
-      </w:r>
-    </w:p>
-    <w:p>
-      <w:pPr>
-        <w:widowControl/>
-      </w:pPr>
-      <w:r>
-        <w:rPr>
-          <w:rFonts w:eastAsia="Hiragino Mincho ProN"/>
-        </w:rPr>
-        <w:t>Existing work rarely examines the promotion timeline, institutional movement, and project-based academic resources with the same longitudinal population. The dissertation addresses this gap without treating mobility or funding as exogenous interventions.</w:t>
+        <w:t>Existing work rarely examines the promotion timeline, institutional movement, and project-based academic resources with the same longitudinal population. The dissertation links them while preserving distinct outcomes and risk sets. It asks where gender differences appear, whether organizational movement is associated with the observed timeline, and whether KAKEN-related resources are differently associated with promotion across career stages.</w:t>
+      </w:r>
+    </w:p>
+    <w:p>
+      <w:r>
+        <w:br w:type="page"/>
       </w:r>
     </w:p>
     <w:p>
@@ -902,6 +1071,11 @@
           <w:rFonts w:eastAsia="Hiragino Mincho ProN"/>
         </w:rPr>
         <w:t>The analysis uses structured records of professional careers and reports only aggregate results. Temporal ordering improves interpretation but does not remove selection, measurement error, or unobserved confounding.</w:t>
+      </w:r>
+    </w:p>
+    <w:p>
+      <w:r>
+        <w:br w:type="page"/>
       </w:r>
     </w:p>
     <w:p>
@@ -1152,6 +1326,11 @@
       </w:r>
     </w:p>
     <w:p>
+      <w:r>
+        <w:br w:type="page"/>
+      </w:r>
+    </w:p>
+    <w:p>
       <w:pPr>
         <w:pStyle w:val="3"/>
       </w:pPr>
@@ -1236,7 +1415,7 @@
         <w:rPr>
           <w:rFonts w:eastAsia="Hiragino Mincho ProN"/>
         </w:rPr>
-        <w:t>The primary predictor is cumulative institutional move count before year t. Secondary measures distinguish upward, lateral, and downward moves, internal and external promotion, time since the last move, and mobility per observed career year. Prestige percentiles and institution size provide context rather than separate theoretical centers.</w:t>
+        <w:t>The variable hierarchy is fixed in advance. The primary explanatory variable is cumulative institutional move count before year t. It provides the clearest test of whether repeated organizational movement is related to the promotion timeline. Secondary mobility variables distinguish upward, lateral, and downward moves, internal and external promotion, time since the last move, and mobility per observed career year. Institutional ranking and size are contextual measures used to describe destinations and test robustness; they are not competing explanations or substitutes for move count.</w:t>
       </w:r>
     </w:p>
     <w:p>
@@ -1255,7 +1434,7 @@
         <w:rPr>
           <w:rFonts w:eastAsia="Hiragino Mincho ProN"/>
         </w:rPr>
-        <w:t>The main analysis models time to first Associate Professor appointment. Where coverage permits, the AP-to-FP transition is examined separately. Gender-by-move-count interactions are interpreted through predicted probabilities and marginal effects. Sequence analysis provides a secondary typology of institutional stability and movement.</w:t>
+        <w:t>The core event-history analysis models time to first Associate Professor appointment using move count and a gender-by-move-count interaction. Directional measures enter secondary models after the main association has been established. Ranking and size measures are introduced only in contextual or robustness specifications. Multichannel sequence analysis is supplementary: it identifies recurring patterns of institutional stability and movement but does not define the main outcome or replace the event-history model. Where coverage permits, the AP-to-FP transition is examined separately.</w:t>
       </w:r>
     </w:p>
     <w:p>
@@ -1399,6 +1578,11 @@
           <w:rFonts w:eastAsia="Hiragino Mincho ProN"/>
         </w:rPr>
         <w:t>[Insert chapter summary here] Mobility captures movement between organizations; Chapter 6 examines access to academic resources within and across career stages.</w:t>
+      </w:r>
+    </w:p>
+    <w:p>
+      <w:r>
+        <w:br w:type="page"/>
       </w:r>
     </w:p>
     <w:p>
@@ -1876,6 +2060,11 @@
       </w:r>
     </w:p>
     <w:p>
+      <w:r>
+        <w:br w:type="page"/>
+      </w:r>
+    </w:p>
+    <w:p>
       <w:pPr>
         <w:pStyle w:val="3"/>
       </w:pPr>
@@ -2055,6 +2244,11 @@
       </w:r>
     </w:p>
     <w:p>
+      <w:r>
+        <w:br w:type="page"/>
+      </w:r>
+    </w:p>
+    <w:p>
       <w:pPr>
         <w:pStyle w:val="3"/>
       </w:pPr>
@@ -2531,9 +2725,13 @@
       </w:r>
     </w:p>
     <w:sectPr>
-      <w:pgSz w:w="11906" w:h="16838"/>
-      <w:pgMar w:top="1152" w:right="1296" w:bottom="1152" w:left="1296" w:header="720" w:footer="720" w:gutter="0"/>
+      <w:headerReference w:type="default" r:id="rId17"/>
+      <w:headerReference w:type="even" r:id="rId18"/>
+      <w:headerReference w:type="first" r:id="rId19"/>
+      <w:pgSz w:w="10440" w:h="15120"/>
+      <w:pgMar w:top="1584" w:right="1800" w:bottom="1584" w:left="1800" w:header="648" w:footer="648" w:gutter="0"/>
       <w:cols w:space="720" w:num="1"/>
+      <w:titlePg/>
       <w:docGrid w:linePitch="360" w:charSpace="0"/>
     </w:sectPr>
   </w:body>
@@ -2614,6 +2812,44 @@
     </w:p>
   </w:footnote>
 </w:footnotes>
+</file>
+
+<file path=word/header1.xml><?xml version="1.0" encoding="utf-8"?>
+<w:hdr xmlns:m="http://schemas.openxmlformats.org/officeDocument/2006/math" xmlns:mc="http://schemas.openxmlformats.org/markup-compatibility/2006" xmlns:mo="http://schemas.microsoft.com/office/mac/office/2008/main" xmlns:mv="urn:schemas-microsoft-com:mac:vml" xmlns:o="urn:schemas-microsoft-com:office:office" xmlns:r="http://schemas.openxmlformats.org/officeDocument/2006/relationships" xmlns:v="urn:schemas-microsoft-com:vml" xmlns:w10="urn:schemas-microsoft-com:office:word" xmlns:w14="http://schemas.microsoft.com/office/word/2010/wordml" xmlns:w="http://schemas.openxmlformats.org/wordprocessingml/2006/main" xmlns:wne="http://schemas.microsoft.com/office/word/2006/wordml" xmlns:wp14="http://schemas.microsoft.com/office/word/2010/wordprocessingDrawing" xmlns:wp="http://schemas.openxmlformats.org/drawingml/2006/wordprocessingDrawing" xmlns:wpc="http://schemas.microsoft.com/office/word/2010/wordprocessingCanvas" xmlns:wpg="http://schemas.microsoft.com/office/word/2010/wordprocessingGroup" xmlns:wpi="http://schemas.microsoft.com/office/word/2010/wordprocessingInk" xmlns:wps="http://schemas.microsoft.com/office/word/2010/wordprocessingShape" mc:Ignorable="w14 wp14">
+  <w:p>
+    <w:pPr>
+      <w:jc w:val="right"/>
+    </w:pPr>
+    <w:r>
+      <w:fldChar w:fldCharType="begin"/>
+      <w:instrText xml:space="preserve"> PAGE </w:instrText>
+      <w:fldChar w:fldCharType="separate"/>
+      <w:t>1</w:t>
+      <w:fldChar w:fldCharType="end"/>
+    </w:r>
+  </w:p>
+</w:hdr>
+</file>
+
+<file path=word/header2.xml><?xml version="1.0" encoding="utf-8"?>
+<w:hdr xmlns:m="http://schemas.openxmlformats.org/officeDocument/2006/math" xmlns:mc="http://schemas.openxmlformats.org/markup-compatibility/2006" xmlns:mo="http://schemas.microsoft.com/office/mac/office/2008/main" xmlns:mv="urn:schemas-microsoft-com:mac:vml" xmlns:o="urn:schemas-microsoft-com:office:office" xmlns:r="http://schemas.openxmlformats.org/officeDocument/2006/relationships" xmlns:v="urn:schemas-microsoft-com:vml" xmlns:w10="urn:schemas-microsoft-com:office:word" xmlns:w14="http://schemas.microsoft.com/office/word/2010/wordml" xmlns:w="http://schemas.openxmlformats.org/wordprocessingml/2006/main" xmlns:wne="http://schemas.microsoft.com/office/word/2006/wordml" xmlns:wp14="http://schemas.microsoft.com/office/word/2010/wordprocessingDrawing" xmlns:wp="http://schemas.openxmlformats.org/drawingml/2006/wordprocessingDrawing" xmlns:wpc="http://schemas.microsoft.com/office/word/2010/wordprocessingCanvas" xmlns:wpg="http://schemas.microsoft.com/office/word/2010/wordprocessingGroup" xmlns:wpi="http://schemas.microsoft.com/office/word/2010/wordprocessingInk" xmlns:wps="http://schemas.microsoft.com/office/word/2010/wordprocessingShape" mc:Ignorable="w14 wp14">
+  <w:p>
+    <w:pPr>
+      <w:jc w:val="left"/>
+    </w:pPr>
+    <w:r>
+      <w:fldChar w:fldCharType="begin"/>
+      <w:instrText xml:space="preserve"> PAGE </w:instrText>
+      <w:fldChar w:fldCharType="separate"/>
+      <w:t>1</w:t>
+      <w:fldChar w:fldCharType="end"/>
+    </w:r>
+  </w:p>
+</w:hdr>
+</file>
+
+<file path=word/header3.xml><?xml version="1.0" encoding="utf-8"?>
+<w:hdr xmlns:m="http://schemas.openxmlformats.org/officeDocument/2006/math" xmlns:mc="http://schemas.openxmlformats.org/markup-compatibility/2006" xmlns:mo="http://schemas.microsoft.com/office/mac/office/2008/main" xmlns:mv="urn:schemas-microsoft-com:mac:vml" xmlns:o="urn:schemas-microsoft-com:office:office" xmlns:r="http://schemas.openxmlformats.org/officeDocument/2006/relationships" xmlns:v="urn:schemas-microsoft-com:vml" xmlns:w10="urn:schemas-microsoft-com:office:word" xmlns:w14="http://schemas.microsoft.com/office/word/2010/wordml" xmlns:w="http://schemas.openxmlformats.org/wordprocessingml/2006/main" xmlns:wne="http://schemas.microsoft.com/office/word/2006/wordml" xmlns:wp14="http://schemas.microsoft.com/office/word/2010/wordprocessingDrawing" xmlns:wp="http://schemas.openxmlformats.org/drawingml/2006/wordprocessingDrawing" xmlns:wpc="http://schemas.microsoft.com/office/word/2010/wordprocessingCanvas" xmlns:wpg="http://schemas.microsoft.com/office/word/2010/wordprocessingGroup" xmlns:wpi="http://schemas.microsoft.com/office/word/2010/wordprocessingInk" xmlns:wps="http://schemas.microsoft.com/office/word/2010/wordprocessingShape" mc:Ignorable="w14 wp14"/>
 </file>
 
 <file path=word/numbering.xml><?xml version="1.0" encoding="utf-8"?>

</xml_diff>